<commit_message>
Cập nhật file lần cuối
</commit_message>
<xml_diff>
--- a/finall_report/Baocao_ 18A1 _Nhom_ 3_Case_5.docx
+++ b/finall_report/Baocao_ 18A1 _Nhom_ 3_Case_5.docx
@@ -64,7 +64,14 @@
           <w:b/>
           <w:bCs/>
         </w:rPr>
-        <w:t>Bài tập: Case 9</w:t>
+        <w:t xml:space="preserve">Bài tập: Case </w:t>
+      </w:r>
+      <w:r>
+        <w:rPr>
+          <w:b/>
+          <w:bCs/>
+        </w:rPr>
+        <w:t>5</w:t>
       </w:r>
     </w:p>
     <w:p>
@@ -537,7 +544,7 @@
           <v:shape id="_x0000_i1025" type="#_x0000_t75" style="width:66pt;height:48pt" o:ole="">
             <v:imagedata r:id="rId5" o:title=""/>
           </v:shape>
-          <o:OLEObject Type="Embed" ProgID="Excel.SheetMacroEnabled.12" ShapeID="_x0000_i1025" DrawAspect="Icon" ObjectID="_1827332429" r:id="rId6"/>
+          <o:OLEObject Type="Embed" ProgID="Excel.SheetMacroEnabled.12" ShapeID="_x0000_i1025" DrawAspect="Icon" ObjectID="_1827334420" r:id="rId6"/>
         </w:object>
       </w:r>
       <w:r>
@@ -548,7 +555,7 @@
           <v:shape id="_x0000_i1026" type="#_x0000_t75" style="width:78pt;height:48pt" o:ole="">
             <v:imagedata r:id="rId7" o:title=""/>
           </v:shape>
-          <o:OLEObject Type="Embed" ProgID="Excel.SheetMacroEnabled.12" ShapeID="_x0000_i1026" DrawAspect="Icon" ObjectID="_1827332430" r:id="rId8"/>
+          <o:OLEObject Type="Embed" ProgID="Excel.SheetMacroEnabled.12" ShapeID="_x0000_i1026" DrawAspect="Icon" ObjectID="_1827334421" r:id="rId8"/>
         </w:object>
       </w:r>
       <w:r>
@@ -559,7 +566,7 @@
           <v:shape id="_x0000_i1027" type="#_x0000_t75" style="width:78pt;height:48pt" o:ole="">
             <v:imagedata r:id="rId9" o:title=""/>
           </v:shape>
-          <o:OLEObject Type="Embed" ProgID="Excel.SheetMacroEnabled.12" ShapeID="_x0000_i1027" DrawAspect="Icon" ObjectID="_1827332431" r:id="rId10"/>
+          <o:OLEObject Type="Embed" ProgID="Excel.SheetMacroEnabled.12" ShapeID="_x0000_i1027" DrawAspect="Icon" ObjectID="_1827334422" r:id="rId10"/>
         </w:object>
       </w:r>
     </w:p>
@@ -1766,7 +1773,7 @@
           <v:shape id="_x0000_i1028" type="#_x0000_t75" style="width:78pt;height:48pt" o:ole="">
             <v:imagedata r:id="rId11" o:title=""/>
           </v:shape>
-          <o:OLEObject Type="Embed" ProgID="Excel.SheetMacroEnabled.12" ShapeID="_x0000_i1028" DrawAspect="Icon" ObjectID="_1827332432" r:id="rId12"/>
+          <o:OLEObject Type="Embed" ProgID="Excel.SheetMacroEnabled.12" ShapeID="_x0000_i1028" DrawAspect="Icon" ObjectID="_1827334423" r:id="rId12"/>
         </w:object>
       </w:r>
       <w:r>
@@ -1774,7 +1781,7 @@
           <v:shape id="_x0000_i1029" type="#_x0000_t75" style="width:78pt;height:48pt" o:ole="">
             <v:imagedata r:id="rId13" o:title=""/>
           </v:shape>
-          <o:OLEObject Type="Embed" ProgID="Excel.SheetMacroEnabled.12" ShapeID="_x0000_i1029" DrawAspect="Icon" ObjectID="_1827332433" r:id="rId14"/>
+          <o:OLEObject Type="Embed" ProgID="Excel.SheetMacroEnabled.12" ShapeID="_x0000_i1029" DrawAspect="Icon" ObjectID="_1827334424" r:id="rId14"/>
         </w:object>
       </w:r>
       <w:r>
@@ -1782,7 +1789,7 @@
           <v:shape id="_x0000_i1030" type="#_x0000_t75" style="width:78pt;height:48pt" o:ole="">
             <v:imagedata r:id="rId15" o:title=""/>
           </v:shape>
-          <o:OLEObject Type="Embed" ProgID="Excel.SheetMacroEnabled.12" ShapeID="_x0000_i1030" DrawAspect="Icon" ObjectID="_1827332434" r:id="rId16"/>
+          <o:OLEObject Type="Embed" ProgID="Excel.SheetMacroEnabled.12" ShapeID="_x0000_i1030" DrawAspect="Icon" ObjectID="_1827334425" r:id="rId16"/>
         </w:object>
       </w:r>
     </w:p>
@@ -1866,21 +1873,7 @@
           <w:b/>
           <w:bCs/>
         </w:rPr>
-        <w:t xml:space="preserve">1. </w:t>
-      </w:r>
-      <w:r>
-        <w:rPr>
-          <w:b/>
-          <w:bCs/>
-        </w:rPr>
-        <w:t>Pivot tỷ lệ chuyển đổi theo kênh × loại phản hồi</w:t>
-      </w:r>
-      <w:r>
-        <w:rPr>
-          <w:b/>
-          <w:bCs/>
-        </w:rPr>
-        <w:t xml:space="preserve">: </w:t>
+        <w:t xml:space="preserve">1. Pivot tỷ lệ chuyển đổi theo kênh × loại phản hồi: </w:t>
       </w:r>
     </w:p>
     <w:p>
@@ -2412,6 +2405,7 @@
         <w:rPr>
           <w:b/>
           <w:bCs/>
+          <w:noProof/>
         </w:rPr>
         <w:lastRenderedPageBreak/>
         <w:drawing>
@@ -2546,6 +2540,7 @@
         <w:rPr>
           <w:b/>
           <w:bCs/>
+          <w:noProof/>
         </w:rPr>
         <w:drawing>
           <wp:inline distT="0" distB="0" distL="0" distR="0" wp14:anchorId="5FB4D3F8" wp14:editId="25D49865">
@@ -2677,16 +2672,7 @@
           <w:sz w:val="28"/>
           <w:szCs w:val="28"/>
         </w:rPr>
-        <w:t xml:space="preserve">XI. </w:t>
-      </w:r>
-      <w:r>
-        <w:rPr>
-          <w:b/>
-          <w:bCs/>
-          <w:sz w:val="28"/>
-          <w:szCs w:val="28"/>
-        </w:rPr>
-        <w:t>Phương pháp xử lý và phân tích dữ liệu</w:t>
+        <w:t>XI. Phương pháp xử lý và phân tích dữ liệu</w:t>
       </w:r>
     </w:p>
     <w:tbl>
@@ -2752,10 +2738,7 @@
               <w:t xml:space="preserve">       </w:t>
             </w:r>
             <w:r>
-              <w:t>Nhập xuất file (I/O)</w:t>
-            </w:r>
-            <w:r>
-              <w:t xml:space="preserve"> </w:t>
+              <w:t xml:space="preserve">Nhập xuất file (I/O) </w:t>
             </w:r>
           </w:p>
         </w:tc>
@@ -2765,13 +2748,7 @@
           </w:tcPr>
           <w:p>
             <w:r>
-              <w:t>read_csv()</w:t>
-            </w:r>
-            <w:r>
-              <w:t xml:space="preserve">, </w:t>
-            </w:r>
-            <w:r>
-              <w:t>to_csv()</w:t>
+              <w:t>read_csv(), to_csv()</w:t>
             </w:r>
           </w:p>
           <w:p/>
@@ -3076,16 +3053,7 @@
           <w:sz w:val="28"/>
           <w:szCs w:val="28"/>
         </w:rPr>
-        <w:t xml:space="preserve">. </w:t>
-      </w:r>
-      <w:r>
-        <w:rPr>
-          <w:b/>
-          <w:bCs/>
-          <w:sz w:val="28"/>
-          <w:szCs w:val="28"/>
-        </w:rPr>
-        <w:t>Nhật ký nhóm : thể hiện mức độ tham gia của từng thành viên .</w:t>
+        <w:t>. Nhật ký nhóm : thể hiện mức độ tham gia của từng thành viên .</w:t>
       </w:r>
     </w:p>
     <w:p>
@@ -3114,6 +3082,7 @@
         <w:rPr>
           <w:b/>
           <w:bCs/>
+          <w:noProof/>
           <w:sz w:val="28"/>
           <w:szCs w:val="28"/>
         </w:rPr>
@@ -3170,6 +3139,7 @@
         <w:rPr>
           <w:b/>
           <w:bCs/>
+          <w:noProof/>
           <w:sz w:val="28"/>
           <w:szCs w:val="28"/>
         </w:rPr>
@@ -4418,6 +4388,7 @@
   <w:style w:type="character" w:default="1" w:styleId="DefaultParagraphFont">
     <w:name w:val="Default Paragraph Font"/>
     <w:uiPriority w:val="1"/>
+    <w:semiHidden/>
     <w:unhideWhenUsed/>
   </w:style>
   <w:style w:type="table" w:default="1" w:styleId="TableNormal">

</xml_diff>